<commit_message>
done with answers 7-9
</commit_message>
<xml_diff>
--- a/4. Software/Activities & Questions.docx
+++ b/4. Software/Activities & Questions.docx
@@ -406,23 +406,7 @@
     </w:p>
     <w:p>
       <w:r>
-        <w:t xml:space="preserve">The bootstrap </w:t>
-      </w:r>
-      <w:proofErr w:type="gramStart"/>
-      <w:r>
-        <w:t>provide</w:t>
-      </w:r>
-      <w:proofErr w:type="gramEnd"/>
-      <w:r>
-        <w:t xml:space="preserve"> a pathway in a sequence of operations, it </w:t>
-      </w:r>
-      <w:proofErr w:type="gramStart"/>
-      <w:r>
-        <w:t>provide</w:t>
-      </w:r>
-      <w:proofErr w:type="gramEnd"/>
-      <w:r>
-        <w:t xml:space="preserve"> the foundation, resources, and roles to run the application safely.</w:t>
+        <w:t>The bootstrap provide a pathway in a sequence of operations, it provide the foundation, resources, and roles to run the application safely.</w:t>
       </w:r>
     </w:p>
     <w:p>
@@ -592,15 +576,7 @@
         </w:numPr>
       </w:pPr>
       <w:r>
-        <w:t xml:space="preserve">With the finishing of every FDE cycle processor </w:t>
-      </w:r>
-      <w:proofErr w:type="gramStart"/>
-      <w:r>
-        <w:t>checks</w:t>
-      </w:r>
-      <w:proofErr w:type="gramEnd"/>
-      <w:r>
-        <w:t xml:space="preserve"> for the interrupts.</w:t>
+        <w:t>With the finishing of every FDE cycle processor checks for the interrupts.</w:t>
       </w:r>
     </w:p>
     <w:p>
@@ -707,6 +683,44 @@
         </w:rPr>
         <w:t>Describe what is meant by high-level Language.</w:t>
       </w:r>
+    </w:p>
+    <w:p>
+      <w:pPr>
+        <w:rPr>
+          <w:sz w:val="24"/>
+          <w:szCs w:val="24"/>
+        </w:rPr>
+      </w:pPr>
+      <w:r>
+        <w:rPr>
+          <w:sz w:val="24"/>
+          <w:szCs w:val="24"/>
+        </w:rPr>
+        <w:t>Answer:</w:t>
+      </w:r>
+    </w:p>
+    <w:p>
+      <w:pPr>
+        <w:rPr>
+          <w:sz w:val="24"/>
+          <w:szCs w:val="24"/>
+        </w:rPr>
+      </w:pPr>
+      <w:r>
+        <w:rPr>
+          <w:sz w:val="24"/>
+          <w:szCs w:val="24"/>
+        </w:rPr>
+        <w:t>High-level programming language is type of programming language which use simple natural languages keywords for writing its code. For example, if, while, for, input, print. The examples of high-level languages are, java, C++, python etc.</w:t>
+      </w:r>
+    </w:p>
+    <w:p>
+      <w:pPr>
+        <w:rPr>
+          <w:sz w:val="24"/>
+          <w:szCs w:val="24"/>
+        </w:rPr>
+      </w:pPr>
     </w:p>
     <w:p>
       <w:pPr>
@@ -758,6 +772,7 @@
                 <w:sz w:val="24"/>
                 <w:szCs w:val="24"/>
               </w:rPr>
+              <w:lastRenderedPageBreak/>
               <w:t>Program Code</w:t>
             </w:r>
           </w:p>
@@ -845,6 +860,13 @@
                 <w:szCs w:val="24"/>
               </w:rPr>
             </w:pPr>
+            <w:r>
+              <w:rPr>
+                <w:sz w:val="24"/>
+                <w:szCs w:val="24"/>
+              </w:rPr>
+              <w:t>Assembly Language</w:t>
+            </w:r>
           </w:p>
         </w:tc>
       </w:tr>
@@ -895,6 +917,13 @@
                 <w:szCs w:val="24"/>
               </w:rPr>
             </w:pPr>
+            <w:r>
+              <w:rPr>
+                <w:sz w:val="24"/>
+                <w:szCs w:val="24"/>
+              </w:rPr>
+              <w:t>High-level language</w:t>
+            </w:r>
           </w:p>
         </w:tc>
       </w:tr>
@@ -930,7 +959,6 @@
                 <w:sz w:val="24"/>
                 <w:szCs w:val="24"/>
               </w:rPr>
-              <w:lastRenderedPageBreak/>
               <w:t>11010111</w:t>
             </w:r>
           </w:p>
@@ -976,6 +1004,13 @@
                 <w:szCs w:val="24"/>
               </w:rPr>
             </w:pPr>
+            <w:r>
+              <w:rPr>
+                <w:sz w:val="24"/>
+                <w:szCs w:val="24"/>
+              </w:rPr>
+              <w:t>Machine code</w:t>
+            </w:r>
           </w:p>
         </w:tc>
       </w:tr>
@@ -1009,6 +1044,36 @@
           <w:szCs w:val="24"/>
         </w:rPr>
         <w:t xml:space="preserve">Harry needs to write a utility program that uses as little memory as possible. Give the most appropriate type of programming language Harry should use and justify your choice. </w:t>
+      </w:r>
+    </w:p>
+    <w:p>
+      <w:pPr>
+        <w:rPr>
+          <w:sz w:val="24"/>
+          <w:szCs w:val="24"/>
+        </w:rPr>
+      </w:pPr>
+      <w:r>
+        <w:rPr>
+          <w:sz w:val="24"/>
+          <w:szCs w:val="24"/>
+        </w:rPr>
+        <w:t>Answer:</w:t>
+      </w:r>
+    </w:p>
+    <w:p>
+      <w:pPr>
+        <w:rPr>
+          <w:sz w:val="24"/>
+          <w:szCs w:val="24"/>
+        </w:rPr>
+      </w:pPr>
+      <w:r>
+        <w:rPr>
+          <w:sz w:val="24"/>
+          <w:szCs w:val="24"/>
+        </w:rPr>
+        <w:t>As the need of Harry is to use as little memory as possible for the utility program, the most appropriate type of the programming language is Machine code because it don’t need any other resource to deal with instructios.</w:t>
       </w:r>
     </w:p>
     <w:sectPr>

</xml_diff>

<commit_message>
completed the activities and questions
</commit_message>
<xml_diff>
--- a/4. Software/Activities & Questions.docx
+++ b/4. Software/Activities & Questions.docx
@@ -366,19 +366,38 @@
         </w:rPr>
         <w:t>For interpreter: (</w:t>
       </w:r>
-      <w:r>
-        <w:rPr>
-          <w:sz w:val="24"/>
-          <w:szCs w:val="24"/>
-        </w:rPr>
-        <w:t>https://github.com/anwar-513/CAMBRIDGE-IGCSE-O-LEVEL-COMPUTER-SCIENCE-/tree/master/4.%20Software</w:t>
-      </w:r>
-      <w:r>
-        <w:rPr>
-          <w:sz w:val="24"/>
-          <w:szCs w:val="24"/>
-        </w:rPr>
-        <w:t>/for_interpreter.py)</w:t>
+      <w:hyperlink r:id="rId5" w:history="1">
+        <w:r>
+          <w:rPr>
+            <w:rStyle w:val="Hyperlink"/>
+            <w:sz w:val="24"/>
+            <w:szCs w:val="24"/>
+          </w:rPr>
+          <w:t>https://github.com/anwar-513/CAMBRIDGE-IGCSE-O-LEVEL-COMPUTER-SCIENCE-/tree/master/4.%20Software/for</w:t>
+        </w:r>
+        <w:r>
+          <w:rPr>
+            <w:rStyle w:val="Hyperlink"/>
+            <w:sz w:val="24"/>
+            <w:szCs w:val="24"/>
+          </w:rPr>
+          <w:t>-</w:t>
+        </w:r>
+        <w:r>
+          <w:rPr>
+            <w:rStyle w:val="Hyperlink"/>
+            <w:sz w:val="24"/>
+            <w:szCs w:val="24"/>
+          </w:rPr>
+          <w:t>interpreter.py</w:t>
+        </w:r>
+      </w:hyperlink>
+      <w:r>
+        <w:rPr>
+          <w:sz w:val="24"/>
+          <w:szCs w:val="24"/>
+        </w:rPr>
+        <w:t>)</w:t>
       </w:r>
     </w:p>
     <w:p>
@@ -395,19 +414,22 @@
         </w:rPr>
         <w:t>For compiler: (</w:t>
       </w:r>
-      <w:r>
-        <w:rPr>
-          <w:sz w:val="24"/>
-          <w:szCs w:val="24"/>
-        </w:rPr>
-        <w:t>https://github.com/anwar-513/CAMBRIDGE-IGCSE-O-LEVEL-COMPUTER-SCIENCE-/tree/master/4.%20Software</w:t>
-      </w:r>
-      <w:r>
-        <w:rPr>
-          <w:sz w:val="24"/>
-          <w:szCs w:val="24"/>
-        </w:rPr>
-        <w:t>/for-compiler.cpp)</w:t>
+      <w:hyperlink r:id="rId6" w:history="1">
+        <w:r>
+          <w:rPr>
+            <w:rStyle w:val="Hyperlink"/>
+            <w:sz w:val="24"/>
+            <w:szCs w:val="24"/>
+          </w:rPr>
+          <w:t>https://github.com/anwar-513/CAMBRIDGE-IGCSE-O-LEVEL-COMPUTER-SCIENCE-/tree/master/4.%20Software/for-compiler.cpp</w:t>
+        </w:r>
+      </w:hyperlink>
+      <w:r>
+        <w:rPr>
+          <w:sz w:val="24"/>
+          <w:szCs w:val="24"/>
+        </w:rPr>
+        <w:t>)</w:t>
       </w:r>
     </w:p>
     <w:p>
@@ -434,10 +456,187 @@
     </w:p>
     <w:p>
       <w:pPr>
+        <w:rPr>
+          <w:sz w:val="24"/>
+          <w:szCs w:val="24"/>
+        </w:rPr>
+      </w:pPr>
+    </w:p>
+    <w:p>
+      <w:pPr>
+        <w:pStyle w:val="Heading2"/>
+      </w:pPr>
+      <w:r>
+        <w:t>Activity 4.4</w:t>
+      </w:r>
+    </w:p>
+    <w:p>
+      <w:pPr>
+        <w:rPr>
+          <w:sz w:val="24"/>
+          <w:szCs w:val="24"/>
+        </w:rPr>
+      </w:pPr>
+      <w:r>
+        <w:rPr>
+          <w:sz w:val="24"/>
+          <w:szCs w:val="24"/>
+        </w:rPr>
+        <w:t>Open up the IDE that you use to write programs. Identify the features that are mentioned in this chapter. Are there any different ones? If so, find out what these do.</w:t>
+      </w:r>
+    </w:p>
+    <w:p>
+      <w:pPr>
+        <w:rPr>
+          <w:sz w:val="24"/>
+          <w:szCs w:val="24"/>
+        </w:rPr>
+      </w:pPr>
+    </w:p>
+    <w:p>
+      <w:pPr>
+        <w:rPr>
+          <w:sz w:val="24"/>
+          <w:szCs w:val="24"/>
+        </w:rPr>
+      </w:pPr>
+      <w:r>
+        <w:rPr>
+          <w:sz w:val="24"/>
+          <w:szCs w:val="24"/>
+        </w:rPr>
+        <w:t>I usually use the Visual Studio code:</w:t>
+      </w:r>
+    </w:p>
+    <w:p>
+      <w:pPr>
+        <w:pStyle w:val="ListParagraph"/>
+        <w:numPr>
+          <w:ilvl w:val="0"/>
+          <w:numId w:val="7"/>
+        </w:numPr>
+        <w:rPr>
+          <w:sz w:val="24"/>
+          <w:szCs w:val="24"/>
+        </w:rPr>
+      </w:pPr>
+      <w:r>
+        <w:rPr>
+          <w:sz w:val="24"/>
+          <w:szCs w:val="24"/>
+        </w:rPr>
+        <w:t>IntelliSense</w:t>
+      </w:r>
+    </w:p>
+    <w:p>
+      <w:pPr>
+        <w:pStyle w:val="ListParagraph"/>
+        <w:numPr>
+          <w:ilvl w:val="0"/>
+          <w:numId w:val="7"/>
+        </w:numPr>
+        <w:rPr>
+          <w:sz w:val="24"/>
+          <w:szCs w:val="24"/>
+        </w:rPr>
+      </w:pPr>
+      <w:r>
+        <w:rPr>
+          <w:sz w:val="24"/>
+          <w:szCs w:val="24"/>
+        </w:rPr>
+        <w:t xml:space="preserve">Command palette </w:t>
+      </w:r>
+    </w:p>
+    <w:p>
+      <w:pPr>
+        <w:pStyle w:val="ListParagraph"/>
+        <w:numPr>
+          <w:ilvl w:val="0"/>
+          <w:numId w:val="7"/>
+        </w:numPr>
+        <w:rPr>
+          <w:sz w:val="24"/>
+          <w:szCs w:val="24"/>
+        </w:rPr>
+      </w:pPr>
+      <w:r>
+        <w:rPr>
+          <w:sz w:val="24"/>
+          <w:szCs w:val="24"/>
+        </w:rPr>
+        <w:t>Built-in Git</w:t>
+      </w:r>
+    </w:p>
+    <w:p>
+      <w:pPr>
+        <w:pStyle w:val="ListParagraph"/>
+        <w:numPr>
+          <w:ilvl w:val="0"/>
+          <w:numId w:val="7"/>
+        </w:numPr>
+        <w:rPr>
+          <w:sz w:val="24"/>
+          <w:szCs w:val="24"/>
+        </w:rPr>
+      </w:pPr>
+      <w:r>
+        <w:rPr>
+          <w:sz w:val="24"/>
+          <w:szCs w:val="24"/>
+        </w:rPr>
+        <w:t>Extensions</w:t>
+      </w:r>
+    </w:p>
+    <w:p>
+      <w:pPr>
+        <w:pStyle w:val="ListParagraph"/>
+        <w:numPr>
+          <w:ilvl w:val="0"/>
+          <w:numId w:val="7"/>
+        </w:numPr>
+        <w:rPr>
+          <w:sz w:val="24"/>
+          <w:szCs w:val="24"/>
+        </w:rPr>
+      </w:pPr>
+      <w:r>
+        <w:rPr>
+          <w:sz w:val="24"/>
+          <w:szCs w:val="24"/>
+        </w:rPr>
+        <w:t>Debugging</w:t>
+      </w:r>
+    </w:p>
+    <w:p>
+      <w:pPr>
+        <w:pStyle w:val="ListParagraph"/>
+        <w:numPr>
+          <w:ilvl w:val="0"/>
+          <w:numId w:val="7"/>
+        </w:numPr>
+        <w:rPr>
+          <w:sz w:val="24"/>
+          <w:szCs w:val="24"/>
+        </w:rPr>
+      </w:pPr>
+      <w:r>
+        <w:rPr>
+          <w:sz w:val="24"/>
+          <w:szCs w:val="24"/>
+        </w:rPr>
+        <w:t>Multi-cursor editing</w:t>
+      </w:r>
+    </w:p>
+    <w:p>
+      <w:pPr>
         <w:pStyle w:val="Heading1"/>
       </w:pPr>
       <w:r>
-        <w:t>Questions</w:t>
+        <w:t>Question</w:t>
+      </w:r>
+      <w:r>
+        <w:t>s</w:t>
       </w:r>
     </w:p>
     <w:p>
@@ -445,7 +644,10 @@
         <w:pStyle w:val="Heading2"/>
       </w:pPr>
       <w:r>
-        <w:t xml:space="preserve">Q1. </w:t>
+        <w:t xml:space="preserve">QUESTION </w:t>
+      </w:r>
+      <w:r>
+        <w:t xml:space="preserve">1. </w:t>
       </w:r>
     </w:p>
     <w:p>
@@ -467,6 +669,7 @@
         </w:numPr>
       </w:pPr>
       <w:r>
+        <w:lastRenderedPageBreak/>
         <w:t>Word processor. For example, MS word for making documents.</w:t>
       </w:r>
     </w:p>
@@ -487,7 +690,10 @@
         <w:pStyle w:val="Heading2"/>
       </w:pPr>
       <w:r>
-        <w:t xml:space="preserve">Q2. </w:t>
+        <w:t xml:space="preserve">QUESTION </w:t>
+      </w:r>
+      <w:r>
+        <w:t xml:space="preserve">2. </w:t>
       </w:r>
     </w:p>
     <w:p>
@@ -510,7 +716,10 @@
         <w:pStyle w:val="Heading2"/>
       </w:pPr>
       <w:r>
-        <w:t xml:space="preserve">Q3. </w:t>
+        <w:t xml:space="preserve">QUESTION </w:t>
+      </w:r>
+      <w:r>
+        <w:t xml:space="preserve">3. </w:t>
       </w:r>
     </w:p>
     <w:p>
@@ -525,8 +734,19 @@
     </w:p>
     <w:p>
       <w:r>
-        <w:lastRenderedPageBreak/>
-        <w:t>The bootstrap provide a pathway in a sequence of operations, it provide the foundation, resources, and roles to run the application safely.</w:t>
+        <w:t>The bootstrap provide</w:t>
+      </w:r>
+      <w:r>
+        <w:t>s</w:t>
+      </w:r>
+      <w:r>
+        <w:t xml:space="preserve"> a pathway in a sequence of operations, it provide</w:t>
+      </w:r>
+      <w:r>
+        <w:t xml:space="preserve">s </w:t>
+      </w:r>
+      <w:r>
+        <w:t>the foundation, resources, and roles to run the application safely.</w:t>
       </w:r>
     </w:p>
     <w:p>
@@ -534,7 +754,10 @@
         <w:pStyle w:val="Heading2"/>
       </w:pPr>
       <w:r>
-        <w:t>Q4.</w:t>
+        <w:t xml:space="preserve">QUESTION </w:t>
+      </w:r>
+      <w:r>
+        <w:t>4.</w:t>
       </w:r>
     </w:p>
     <w:p>
@@ -588,7 +811,10 @@
         <w:pStyle w:val="Heading2"/>
       </w:pPr>
       <w:r>
-        <w:t>Q5.</w:t>
+        <w:t xml:space="preserve">QUESTION </w:t>
+      </w:r>
+      <w:r>
+        <w:t>5.</w:t>
       </w:r>
     </w:p>
     <w:p>
@@ -668,7 +894,11 @@
         <w:pStyle w:val="Heading2"/>
       </w:pPr>
       <w:r>
-        <w:t>Q6.</w:t>
+        <w:lastRenderedPageBreak/>
+        <w:t xml:space="preserve">QUESTION </w:t>
+      </w:r>
+      <w:r>
+        <w:t>6.</w:t>
       </w:r>
     </w:p>
     <w:p>
@@ -785,7 +1015,10 @@
         <w:pStyle w:val="Heading2"/>
       </w:pPr>
       <w:r>
-        <w:t>Q7.</w:t>
+        <w:t xml:space="preserve">QUESTION </w:t>
+      </w:r>
+      <w:r>
+        <w:t>7.</w:t>
       </w:r>
     </w:p>
     <w:p>
@@ -846,7 +1079,10 @@
         <w:pStyle w:val="Heading2"/>
       </w:pPr>
       <w:r>
-        <w:t>Q8.</w:t>
+        <w:t xml:space="preserve">QUESTION </w:t>
+      </w:r>
+      <w:r>
+        <w:t>8.</w:t>
       </w:r>
     </w:p>
     <w:p>
@@ -1077,6 +1313,7 @@
                 <w:sz w:val="24"/>
                 <w:szCs w:val="24"/>
               </w:rPr>
+              <w:lastRenderedPageBreak/>
               <w:t>11010111</w:t>
             </w:r>
           </w:p>
@@ -1127,6 +1364,7 @@
                 <w:sz w:val="24"/>
                 <w:szCs w:val="24"/>
               </w:rPr>
+              <w:lastRenderedPageBreak/>
               <w:t>Machine code</w:t>
             </w:r>
           </w:p>
@@ -1146,7 +1384,10 @@
         <w:pStyle w:val="Heading2"/>
       </w:pPr>
       <w:r>
-        <w:t xml:space="preserve">Q9. </w:t>
+        <w:t xml:space="preserve">QUESTION </w:t>
+      </w:r>
+      <w:r>
+        <w:t xml:space="preserve">9. </w:t>
       </w:r>
     </w:p>
     <w:p>
@@ -1191,8 +1432,343 @@
           <w:sz w:val="24"/>
           <w:szCs w:val="24"/>
         </w:rPr>
-        <w:t>As the need of Harry is to use as little memory as possible for the utility program, the most appropriate type of the programming language is Machine code because it don’t need any other resource to deal with instructios.</w:t>
-      </w:r>
+        <w:t>As the need of Harry is to use as little memory as possible for the utility program, the most appropriate type of the programming language is Machine code because it do</w:t>
+      </w:r>
+      <w:r>
+        <w:rPr>
+          <w:sz w:val="24"/>
+          <w:szCs w:val="24"/>
+        </w:rPr>
+        <w:t>es</w:t>
+      </w:r>
+      <w:r>
+        <w:rPr>
+          <w:sz w:val="24"/>
+          <w:szCs w:val="24"/>
+        </w:rPr>
+        <w:t xml:space="preserve">’t need any other resource to deal with </w:t>
+      </w:r>
+      <w:r>
+        <w:rPr>
+          <w:sz w:val="24"/>
+          <w:szCs w:val="24"/>
+        </w:rPr>
+        <w:t>instructions</w:t>
+      </w:r>
+      <w:r>
+        <w:rPr>
+          <w:sz w:val="24"/>
+          <w:szCs w:val="24"/>
+        </w:rPr>
+        <w:t>.</w:t>
+      </w:r>
+    </w:p>
+    <w:p>
+      <w:pPr>
+        <w:rPr>
+          <w:sz w:val="24"/>
+          <w:szCs w:val="24"/>
+        </w:rPr>
+      </w:pPr>
+    </w:p>
+    <w:p>
+      <w:pPr>
+        <w:pStyle w:val="Heading2"/>
+      </w:pPr>
+      <w:r>
+        <w:t>QUESTION 10.</w:t>
+      </w:r>
+    </w:p>
+    <w:p>
+      <w:pPr>
+        <w:rPr>
+          <w:sz w:val="24"/>
+          <w:szCs w:val="24"/>
+        </w:rPr>
+      </w:pPr>
+      <w:r>
+        <w:rPr>
+          <w:sz w:val="24"/>
+          <w:szCs w:val="24"/>
+        </w:rPr>
+        <w:t>Name three types of translators.</w:t>
+      </w:r>
+    </w:p>
+    <w:p>
+      <w:pPr>
+        <w:rPr>
+          <w:sz w:val="24"/>
+          <w:szCs w:val="24"/>
+        </w:rPr>
+      </w:pPr>
+      <w:r>
+        <w:rPr>
+          <w:sz w:val="24"/>
+          <w:szCs w:val="24"/>
+        </w:rPr>
+        <w:t>Answer:</w:t>
+      </w:r>
+    </w:p>
+    <w:p>
+      <w:pPr>
+        <w:pStyle w:val="ListParagraph"/>
+        <w:numPr>
+          <w:ilvl w:val="0"/>
+          <w:numId w:val="8"/>
+        </w:numPr>
+        <w:rPr>
+          <w:sz w:val="24"/>
+          <w:szCs w:val="24"/>
+        </w:rPr>
+      </w:pPr>
+      <w:r>
+        <w:rPr>
+          <w:sz w:val="24"/>
+          <w:szCs w:val="24"/>
+        </w:rPr>
+        <w:t>Compiler</w:t>
+      </w:r>
+    </w:p>
+    <w:p>
+      <w:pPr>
+        <w:pStyle w:val="ListParagraph"/>
+        <w:numPr>
+          <w:ilvl w:val="0"/>
+          <w:numId w:val="8"/>
+        </w:numPr>
+        <w:rPr>
+          <w:sz w:val="24"/>
+          <w:szCs w:val="24"/>
+        </w:rPr>
+      </w:pPr>
+      <w:r>
+        <w:rPr>
+          <w:sz w:val="24"/>
+          <w:szCs w:val="24"/>
+        </w:rPr>
+        <w:t>Interpreter</w:t>
+      </w:r>
+    </w:p>
+    <w:p>
+      <w:pPr>
+        <w:pStyle w:val="ListParagraph"/>
+        <w:numPr>
+          <w:ilvl w:val="0"/>
+          <w:numId w:val="8"/>
+        </w:numPr>
+        <w:rPr>
+          <w:sz w:val="24"/>
+          <w:szCs w:val="24"/>
+        </w:rPr>
+      </w:pPr>
+      <w:r>
+        <w:rPr>
+          <w:sz w:val="24"/>
+          <w:szCs w:val="24"/>
+        </w:rPr>
+        <w:t>Assembler</w:t>
+      </w:r>
+    </w:p>
+    <w:p>
+      <w:pPr>
+        <w:ind w:left="360"/>
+        <w:rPr>
+          <w:sz w:val="24"/>
+          <w:szCs w:val="24"/>
+        </w:rPr>
+      </w:pPr>
+    </w:p>
+    <w:p>
+      <w:pPr>
+        <w:pStyle w:val="Heading2"/>
+      </w:pPr>
+      <w:r>
+        <w:t>QUESTION 11.</w:t>
+      </w:r>
+    </w:p>
+    <w:p>
+      <w:pPr>
+        <w:rPr>
+          <w:sz w:val="24"/>
+          <w:szCs w:val="24"/>
+        </w:rPr>
+      </w:pPr>
+      <w:r>
+        <w:rPr>
+          <w:sz w:val="24"/>
+          <w:szCs w:val="24"/>
+        </w:rPr>
+        <w:t xml:space="preserve">Nasrat is writing a program </w:t>
+      </w:r>
+      <w:r>
+        <w:rPr>
+          <w:sz w:val="24"/>
+          <w:szCs w:val="24"/>
+        </w:rPr>
+        <w:t>in</w:t>
+      </w:r>
+      <w:r>
+        <w:rPr>
+          <w:sz w:val="24"/>
+          <w:szCs w:val="24"/>
+        </w:rPr>
+        <w:t xml:space="preserve"> high-level language that she wants to sell to make money. Identify when Nasrat could use an interpreter, and when she could use a compiler. Justify your decision.</w:t>
+      </w:r>
+    </w:p>
+    <w:p>
+      <w:pPr>
+        <w:rPr>
+          <w:sz w:val="24"/>
+          <w:szCs w:val="24"/>
+        </w:rPr>
+      </w:pPr>
+      <w:r>
+        <w:rPr>
+          <w:sz w:val="24"/>
+          <w:szCs w:val="24"/>
+        </w:rPr>
+        <w:t>Answer:</w:t>
+      </w:r>
+    </w:p>
+    <w:p>
+      <w:pPr>
+        <w:rPr>
+          <w:sz w:val="24"/>
+          <w:szCs w:val="24"/>
+        </w:rPr>
+      </w:pPr>
+      <w:r>
+        <w:rPr>
+          <w:sz w:val="24"/>
+          <w:szCs w:val="24"/>
+        </w:rPr>
+        <w:t xml:space="preserve">Nasrat will have to use interpreter while writing the code so she easily catch the error, prevent long awaiting for compiling the whole code again and again for each line, while she needs to use compiler when the code is completed because the compiler generate the executable file which she can sell without giving her code to anyone. </w:t>
+      </w:r>
+    </w:p>
+    <w:p>
+      <w:pPr>
+        <w:pStyle w:val="Heading2"/>
+      </w:pPr>
+      <w:r>
+        <w:lastRenderedPageBreak/>
+        <w:t>QUESTION 12.</w:t>
+      </w:r>
+    </w:p>
+    <w:p>
+      <w:pPr>
+        <w:rPr>
+          <w:sz w:val="24"/>
+          <w:szCs w:val="24"/>
+        </w:rPr>
+      </w:pPr>
+      <w:r>
+        <w:rPr>
+          <w:sz w:val="24"/>
+          <w:szCs w:val="24"/>
+        </w:rPr>
+        <w:t>Describe two features of an IDE that help the user to test the program they have written.</w:t>
+      </w:r>
+    </w:p>
+    <w:p>
+      <w:pPr>
+        <w:rPr>
+          <w:sz w:val="24"/>
+          <w:szCs w:val="24"/>
+        </w:rPr>
+      </w:pPr>
+      <w:r>
+        <w:rPr>
+          <w:sz w:val="24"/>
+          <w:szCs w:val="24"/>
+        </w:rPr>
+        <w:t>Answer:</w:t>
+      </w:r>
+    </w:p>
+    <w:p>
+      <w:pPr>
+        <w:pStyle w:val="ListParagraph"/>
+        <w:numPr>
+          <w:ilvl w:val="0"/>
+          <w:numId w:val="9"/>
+        </w:numPr>
+        <w:rPr>
+          <w:sz w:val="24"/>
+          <w:szCs w:val="24"/>
+        </w:rPr>
+      </w:pPr>
+      <w:r>
+        <w:rPr>
+          <w:sz w:val="24"/>
+          <w:szCs w:val="24"/>
+        </w:rPr>
+        <w:t>Buit-in testing tools: allowing users to run automated checks which save time.</w:t>
+      </w:r>
+    </w:p>
+    <w:p>
+      <w:pPr>
+        <w:pStyle w:val="ListParagraph"/>
+        <w:numPr>
+          <w:ilvl w:val="0"/>
+          <w:numId w:val="9"/>
+        </w:numPr>
+        <w:rPr>
+          <w:sz w:val="24"/>
+          <w:szCs w:val="24"/>
+        </w:rPr>
+      </w:pPr>
+      <w:r>
+        <w:rPr>
+          <w:sz w:val="24"/>
+          <w:szCs w:val="24"/>
+        </w:rPr>
+        <w:t xml:space="preserve">Debugging feature: </w:t>
+      </w:r>
+      <w:r>
+        <w:rPr>
+          <w:sz w:val="24"/>
+          <w:szCs w:val="24"/>
+        </w:rPr>
+        <w:t xml:space="preserve">IDE with </w:t>
+      </w:r>
+      <w:r>
+        <w:rPr>
+          <w:sz w:val="24"/>
+          <w:szCs w:val="24"/>
+        </w:rPr>
+        <w:t>diagnostics and graphical debugging tools</w:t>
+      </w:r>
+      <w:r>
+        <w:rPr>
+          <w:b/>
+          <w:bCs/>
+          <w:sz w:val="24"/>
+          <w:szCs w:val="24"/>
+        </w:rPr>
+        <w:t xml:space="preserve"> </w:t>
+      </w:r>
+      <w:r>
+        <w:rPr>
+          <w:sz w:val="24"/>
+          <w:szCs w:val="24"/>
+        </w:rPr>
+        <w:t>identify the bugs and highlight it for the users.</w:t>
+      </w:r>
+    </w:p>
+    <w:p>
+      <w:pPr>
+        <w:rPr>
+          <w:sz w:val="24"/>
+          <w:szCs w:val="24"/>
+        </w:rPr>
+      </w:pPr>
+    </w:p>
+    <w:p>
+      <w:pPr>
+        <w:rPr>
+          <w:sz w:val="24"/>
+          <w:szCs w:val="24"/>
+        </w:rPr>
+      </w:pPr>
     </w:p>
     <w:sectPr>
       <w:pgSz w:w="12240" w:h="15840"/>
@@ -1207,6 +1783,95 @@
 <file path=word/numbering.xml><?xml version="1.0" encoding="utf-8"?>
 <w:numbering xmlns:wpc="http://schemas.microsoft.com/office/word/2010/wordprocessingCanvas" xmlns:cx="http://schemas.microsoft.com/office/drawing/2014/chartex" xmlns:cx1="http://schemas.microsoft.com/office/drawing/2015/9/8/chartex" xmlns:cx2="http://schemas.microsoft.com/office/drawing/2015/10/21/chartex" xmlns:cx3="http://schemas.microsoft.com/office/drawing/2016/5/9/chartex" xmlns:cx4="http://schemas.microsoft.com/office/drawing/2016/5/10/chartex" xmlns:cx5="http://schemas.microsoft.com/office/drawing/2016/5/11/chartex" xmlns:cx6="http://schemas.microsoft.com/office/drawing/2016/5/12/chartex" xmlns:cx7="http://schemas.microsoft.com/office/drawing/2016/5/13/chartex" xmlns:cx8="http://schemas.microsoft.com/office/drawing/2016/5/14/chartex" xmlns:mc="http://schemas.openxmlformats.org/markup-compatibility/2006" xmlns:aink="http://schemas.microsoft.com/office/drawing/2016/ink" xmlns:am3d="http://schemas.microsoft.com/office/drawing/2017/model3d" xmlns:o="urn:schemas-microsoft-com:office:office" xmlns:oel="http://schemas.microsoft.com/office/2019/extlst" xmlns:r="http://schemas.openxmlformats.org/officeDocument/2006/relationships" xmlns:m="http://schemas.openxmlformats.org/officeDocument/2006/math" xmlns:v="urn:schemas-microsoft-com:vml" xmlns:wp14="http://schemas.microsoft.com/office/word/2010/wordprocessingDrawing" xmlns:wp="http://schemas.openxmlformats.org/drawingml/2006/wordprocessingDrawing" xmlns:w10="urn:schemas-microsoft-com:office:word" xmlns:w="http://schemas.openxmlformats.org/wordprocessingml/2006/main" xmlns:w14="http://schemas.microsoft.com/office/word/2010/wordml" xmlns:w15="http://schemas.microsoft.com/office/word/2012/wordml" xmlns:w16cei="http://schemas.microsoft.com/office/word/2026/wordml/cei" xmlns:w16cex="http://schemas.microsoft.com/office/word/2018/wordml/cex" xmlns:w16cid="http://schemas.microsoft.com/office/word/2016/wordml/cid" xmlns:w16="http://schemas.microsoft.com/office/word/2018/wordml" xmlns:w16du="http://schemas.microsoft.com/office/word/2023/wordml/word16du" xmlns:w16sdtdh="http://schemas.microsoft.com/office/word/2020/wordml/sdtdatahash" xmlns:w16sdtfl="http://schemas.microsoft.com/office/word/2024/wordml/sdtformatlock" xmlns:w16se="http://schemas.microsoft.com/office/word/2015/wordml/symex" xmlns:wpg="http://schemas.microsoft.com/office/word/2010/wordprocessingGroup" xmlns:wpi="http://schemas.microsoft.com/office/word/2010/wordprocessingInk" xmlns:wne="http://schemas.microsoft.com/office/word/2006/wordml" xmlns:wps="http://schemas.microsoft.com/office/word/2010/wordprocessingShape" mc:Ignorable="w14 w15 w16se w16cid w16 w16cex w16sdtdh w16sdtfl w16du wp14">
   <w:abstractNum w:abstractNumId="0" w15:restartNumberingAfterBreak="0">
+    <w:nsid w:val="040F6996"/>
+    <w:multiLevelType w:val="hybridMultilevel"/>
+    <w:tmpl w:val="A97ED940"/>
+    <w:lvl w:ilvl="0" w:tplc="0409000F">
+      <w:start w:val="1"/>
+      <w:numFmt w:val="decimal"/>
+      <w:lvlText w:val="%1."/>
+      <w:lvlJc w:val="left"/>
+      <w:pPr>
+        <w:ind w:left="720" w:hanging="360"/>
+      </w:pPr>
+      <w:rPr>
+        <w:rFonts w:hint="default"/>
+      </w:rPr>
+    </w:lvl>
+    <w:lvl w:ilvl="1" w:tplc="04090019" w:tentative="1">
+      <w:start w:val="1"/>
+      <w:numFmt w:val="lowerLetter"/>
+      <w:lvlText w:val="%2."/>
+      <w:lvlJc w:val="left"/>
+      <w:pPr>
+        <w:ind w:left="1440" w:hanging="360"/>
+      </w:pPr>
+    </w:lvl>
+    <w:lvl w:ilvl="2" w:tplc="0409001B" w:tentative="1">
+      <w:start w:val="1"/>
+      <w:numFmt w:val="lowerRoman"/>
+      <w:lvlText w:val="%3."/>
+      <w:lvlJc w:val="right"/>
+      <w:pPr>
+        <w:ind w:left="2160" w:hanging="180"/>
+      </w:pPr>
+    </w:lvl>
+    <w:lvl w:ilvl="3" w:tplc="0409000F" w:tentative="1">
+      <w:start w:val="1"/>
+      <w:numFmt w:val="decimal"/>
+      <w:lvlText w:val="%4."/>
+      <w:lvlJc w:val="left"/>
+      <w:pPr>
+        <w:ind w:left="2880" w:hanging="360"/>
+      </w:pPr>
+    </w:lvl>
+    <w:lvl w:ilvl="4" w:tplc="04090019" w:tentative="1">
+      <w:start w:val="1"/>
+      <w:numFmt w:val="lowerLetter"/>
+      <w:lvlText w:val="%5."/>
+      <w:lvlJc w:val="left"/>
+      <w:pPr>
+        <w:ind w:left="3600" w:hanging="360"/>
+      </w:pPr>
+    </w:lvl>
+    <w:lvl w:ilvl="5" w:tplc="0409001B" w:tentative="1">
+      <w:start w:val="1"/>
+      <w:numFmt w:val="lowerRoman"/>
+      <w:lvlText w:val="%6."/>
+      <w:lvlJc w:val="right"/>
+      <w:pPr>
+        <w:ind w:left="4320" w:hanging="180"/>
+      </w:pPr>
+    </w:lvl>
+    <w:lvl w:ilvl="6" w:tplc="0409000F" w:tentative="1">
+      <w:start w:val="1"/>
+      <w:numFmt w:val="decimal"/>
+      <w:lvlText w:val="%7."/>
+      <w:lvlJc w:val="left"/>
+      <w:pPr>
+        <w:ind w:left="5040" w:hanging="360"/>
+      </w:pPr>
+    </w:lvl>
+    <w:lvl w:ilvl="7" w:tplc="04090019" w:tentative="1">
+      <w:start w:val="1"/>
+      <w:numFmt w:val="lowerLetter"/>
+      <w:lvlText w:val="%8."/>
+      <w:lvlJc w:val="left"/>
+      <w:pPr>
+        <w:ind w:left="5760" w:hanging="360"/>
+      </w:pPr>
+    </w:lvl>
+    <w:lvl w:ilvl="8" w:tplc="0409001B" w:tentative="1">
+      <w:start w:val="1"/>
+      <w:numFmt w:val="lowerRoman"/>
+      <w:lvlText w:val="%9."/>
+      <w:lvlJc w:val="right"/>
+      <w:pPr>
+        <w:ind w:left="6480" w:hanging="180"/>
+      </w:pPr>
+    </w:lvl>
+  </w:abstractNum>
+  <w:abstractNum w:abstractNumId="1" w15:restartNumberingAfterBreak="0">
     <w:nsid w:val="12B564A3"/>
     <w:multiLevelType w:val="hybridMultilevel"/>
     <w:tmpl w:val="4E3CB8E6"/>
@@ -1295,7 +1960,7 @@
       </w:pPr>
     </w:lvl>
   </w:abstractNum>
-  <w:abstractNum w:abstractNumId="1" w15:restartNumberingAfterBreak="0">
+  <w:abstractNum w:abstractNumId="2" w15:restartNumberingAfterBreak="0">
     <w:nsid w:val="1A60113E"/>
     <w:multiLevelType w:val="hybridMultilevel"/>
     <w:tmpl w:val="B0C40340"/>
@@ -1384,7 +2049,7 @@
       </w:pPr>
     </w:lvl>
   </w:abstractNum>
-  <w:abstractNum w:abstractNumId="2" w15:restartNumberingAfterBreak="0">
+  <w:abstractNum w:abstractNumId="3" w15:restartNumberingAfterBreak="0">
     <w:nsid w:val="25991D9E"/>
     <w:multiLevelType w:val="hybridMultilevel"/>
     <w:tmpl w:val="E09085B6"/>
@@ -1473,7 +2138,96 @@
       </w:pPr>
     </w:lvl>
   </w:abstractNum>
-  <w:abstractNum w:abstractNumId="3" w15:restartNumberingAfterBreak="0">
+  <w:abstractNum w:abstractNumId="4" w15:restartNumberingAfterBreak="0">
+    <w:nsid w:val="35B80478"/>
+    <w:multiLevelType w:val="hybridMultilevel"/>
+    <w:tmpl w:val="00425C78"/>
+    <w:lvl w:ilvl="0" w:tplc="0409000F">
+      <w:start w:val="1"/>
+      <w:numFmt w:val="decimal"/>
+      <w:lvlText w:val="%1."/>
+      <w:lvlJc w:val="left"/>
+      <w:pPr>
+        <w:ind w:left="720" w:hanging="360"/>
+      </w:pPr>
+      <w:rPr>
+        <w:rFonts w:hint="default"/>
+      </w:rPr>
+    </w:lvl>
+    <w:lvl w:ilvl="1" w:tplc="04090019" w:tentative="1">
+      <w:start w:val="1"/>
+      <w:numFmt w:val="lowerLetter"/>
+      <w:lvlText w:val="%2."/>
+      <w:lvlJc w:val="left"/>
+      <w:pPr>
+        <w:ind w:left="1440" w:hanging="360"/>
+      </w:pPr>
+    </w:lvl>
+    <w:lvl w:ilvl="2" w:tplc="0409001B" w:tentative="1">
+      <w:start w:val="1"/>
+      <w:numFmt w:val="lowerRoman"/>
+      <w:lvlText w:val="%3."/>
+      <w:lvlJc w:val="right"/>
+      <w:pPr>
+        <w:ind w:left="2160" w:hanging="180"/>
+      </w:pPr>
+    </w:lvl>
+    <w:lvl w:ilvl="3" w:tplc="0409000F" w:tentative="1">
+      <w:start w:val="1"/>
+      <w:numFmt w:val="decimal"/>
+      <w:lvlText w:val="%4."/>
+      <w:lvlJc w:val="left"/>
+      <w:pPr>
+        <w:ind w:left="2880" w:hanging="360"/>
+      </w:pPr>
+    </w:lvl>
+    <w:lvl w:ilvl="4" w:tplc="04090019" w:tentative="1">
+      <w:start w:val="1"/>
+      <w:numFmt w:val="lowerLetter"/>
+      <w:lvlText w:val="%5."/>
+      <w:lvlJc w:val="left"/>
+      <w:pPr>
+        <w:ind w:left="3600" w:hanging="360"/>
+      </w:pPr>
+    </w:lvl>
+    <w:lvl w:ilvl="5" w:tplc="0409001B" w:tentative="1">
+      <w:start w:val="1"/>
+      <w:numFmt w:val="lowerRoman"/>
+      <w:lvlText w:val="%6."/>
+      <w:lvlJc w:val="right"/>
+      <w:pPr>
+        <w:ind w:left="4320" w:hanging="180"/>
+      </w:pPr>
+    </w:lvl>
+    <w:lvl w:ilvl="6" w:tplc="0409000F" w:tentative="1">
+      <w:start w:val="1"/>
+      <w:numFmt w:val="decimal"/>
+      <w:lvlText w:val="%7."/>
+      <w:lvlJc w:val="left"/>
+      <w:pPr>
+        <w:ind w:left="5040" w:hanging="360"/>
+      </w:pPr>
+    </w:lvl>
+    <w:lvl w:ilvl="7" w:tplc="04090019" w:tentative="1">
+      <w:start w:val="1"/>
+      <w:numFmt w:val="lowerLetter"/>
+      <w:lvlText w:val="%8."/>
+      <w:lvlJc w:val="left"/>
+      <w:pPr>
+        <w:ind w:left="5760" w:hanging="360"/>
+      </w:pPr>
+    </w:lvl>
+    <w:lvl w:ilvl="8" w:tplc="0409001B" w:tentative="1">
+      <w:start w:val="1"/>
+      <w:numFmt w:val="lowerRoman"/>
+      <w:lvlText w:val="%9."/>
+      <w:lvlJc w:val="right"/>
+      <w:pPr>
+        <w:ind w:left="6480" w:hanging="180"/>
+      </w:pPr>
+    </w:lvl>
+  </w:abstractNum>
+  <w:abstractNum w:abstractNumId="5" w15:restartNumberingAfterBreak="0">
     <w:nsid w:val="44983888"/>
     <w:multiLevelType w:val="hybridMultilevel"/>
     <w:tmpl w:val="D84C9D90"/>
@@ -1562,7 +2316,96 @@
       </w:pPr>
     </w:lvl>
   </w:abstractNum>
-  <w:abstractNum w:abstractNumId="4" w15:restartNumberingAfterBreak="0">
+  <w:abstractNum w:abstractNumId="6" w15:restartNumberingAfterBreak="0">
+    <w:nsid w:val="5D4D1E2A"/>
+    <w:multiLevelType w:val="hybridMultilevel"/>
+    <w:tmpl w:val="3F4CC858"/>
+    <w:lvl w:ilvl="0" w:tplc="B828847E">
+      <w:start w:val="1"/>
+      <w:numFmt w:val="decimal"/>
+      <w:lvlText w:val="%1."/>
+      <w:lvlJc w:val="left"/>
+      <w:pPr>
+        <w:ind w:left="1080" w:hanging="360"/>
+      </w:pPr>
+      <w:rPr>
+        <w:rFonts w:hint="default"/>
+      </w:rPr>
+    </w:lvl>
+    <w:lvl w:ilvl="1" w:tplc="04090019" w:tentative="1">
+      <w:start w:val="1"/>
+      <w:numFmt w:val="lowerLetter"/>
+      <w:lvlText w:val="%2."/>
+      <w:lvlJc w:val="left"/>
+      <w:pPr>
+        <w:ind w:left="1800" w:hanging="360"/>
+      </w:pPr>
+    </w:lvl>
+    <w:lvl w:ilvl="2" w:tplc="0409001B" w:tentative="1">
+      <w:start w:val="1"/>
+      <w:numFmt w:val="lowerRoman"/>
+      <w:lvlText w:val="%3."/>
+      <w:lvlJc w:val="right"/>
+      <w:pPr>
+        <w:ind w:left="2520" w:hanging="180"/>
+      </w:pPr>
+    </w:lvl>
+    <w:lvl w:ilvl="3" w:tplc="0409000F" w:tentative="1">
+      <w:start w:val="1"/>
+      <w:numFmt w:val="decimal"/>
+      <w:lvlText w:val="%4."/>
+      <w:lvlJc w:val="left"/>
+      <w:pPr>
+        <w:ind w:left="3240" w:hanging="360"/>
+      </w:pPr>
+    </w:lvl>
+    <w:lvl w:ilvl="4" w:tplc="04090019" w:tentative="1">
+      <w:start w:val="1"/>
+      <w:numFmt w:val="lowerLetter"/>
+      <w:lvlText w:val="%5."/>
+      <w:lvlJc w:val="left"/>
+      <w:pPr>
+        <w:ind w:left="3960" w:hanging="360"/>
+      </w:pPr>
+    </w:lvl>
+    <w:lvl w:ilvl="5" w:tplc="0409001B" w:tentative="1">
+      <w:start w:val="1"/>
+      <w:numFmt w:val="lowerRoman"/>
+      <w:lvlText w:val="%6."/>
+      <w:lvlJc w:val="right"/>
+      <w:pPr>
+        <w:ind w:left="4680" w:hanging="180"/>
+      </w:pPr>
+    </w:lvl>
+    <w:lvl w:ilvl="6" w:tplc="0409000F" w:tentative="1">
+      <w:start w:val="1"/>
+      <w:numFmt w:val="decimal"/>
+      <w:lvlText w:val="%7."/>
+      <w:lvlJc w:val="left"/>
+      <w:pPr>
+        <w:ind w:left="5400" w:hanging="360"/>
+      </w:pPr>
+    </w:lvl>
+    <w:lvl w:ilvl="7" w:tplc="04090019" w:tentative="1">
+      <w:start w:val="1"/>
+      <w:numFmt w:val="lowerLetter"/>
+      <w:lvlText w:val="%8."/>
+      <w:lvlJc w:val="left"/>
+      <w:pPr>
+        <w:ind w:left="6120" w:hanging="360"/>
+      </w:pPr>
+    </w:lvl>
+    <w:lvl w:ilvl="8" w:tplc="0409001B" w:tentative="1">
+      <w:start w:val="1"/>
+      <w:numFmt w:val="lowerRoman"/>
+      <w:lvlText w:val="%9."/>
+      <w:lvlJc w:val="right"/>
+      <w:pPr>
+        <w:ind w:left="6840" w:hanging="180"/>
+      </w:pPr>
+    </w:lvl>
+  </w:abstractNum>
+  <w:abstractNum w:abstractNumId="7" w15:restartNumberingAfterBreak="0">
     <w:nsid w:val="6C460426"/>
     <w:multiLevelType w:val="hybridMultilevel"/>
     <w:tmpl w:val="7DDCDA54"/>
@@ -1651,7 +2494,7 @@
       </w:pPr>
     </w:lvl>
   </w:abstractNum>
-  <w:abstractNum w:abstractNumId="5" w15:restartNumberingAfterBreak="0">
+  <w:abstractNum w:abstractNumId="8" w15:restartNumberingAfterBreak="0">
     <w:nsid w:val="79370D6D"/>
     <w:multiLevelType w:val="hybridMultilevel"/>
     <w:tmpl w:val="8C2845C4"/>
@@ -1741,22 +2584,31 @@
     </w:lvl>
   </w:abstractNum>
   <w:num w:numId="1" w16cid:durableId="1364405113">
+    <w:abstractNumId w:val="5"/>
+  </w:num>
+  <w:num w:numId="2" w16cid:durableId="1354262250">
+    <w:abstractNumId w:val="2"/>
+  </w:num>
+  <w:num w:numId="3" w16cid:durableId="178080490">
+    <w:abstractNumId w:val="8"/>
+  </w:num>
+  <w:num w:numId="4" w16cid:durableId="1523470828">
+    <w:abstractNumId w:val="7"/>
+  </w:num>
+  <w:num w:numId="5" w16cid:durableId="1383139356">
     <w:abstractNumId w:val="3"/>
   </w:num>
-  <w:num w:numId="2" w16cid:durableId="1354262250">
+  <w:num w:numId="6" w16cid:durableId="190607711">
     <w:abstractNumId w:val="1"/>
   </w:num>
-  <w:num w:numId="3" w16cid:durableId="178080490">
-    <w:abstractNumId w:val="5"/>
+  <w:num w:numId="7" w16cid:durableId="1078556618">
+    <w:abstractNumId w:val="6"/>
   </w:num>
-  <w:num w:numId="4" w16cid:durableId="1523470828">
+  <w:num w:numId="8" w16cid:durableId="1306204393">
+    <w:abstractNumId w:val="0"/>
+  </w:num>
+  <w:num w:numId="9" w16cid:durableId="1931816228">
     <w:abstractNumId w:val="4"/>
-  </w:num>
-  <w:num w:numId="5" w16cid:durableId="1383139356">
-    <w:abstractNumId w:val="2"/>
-  </w:num>
-  <w:num w:numId="6" w16cid:durableId="190607711">
-    <w:abstractNumId w:val="0"/>
   </w:num>
 </w:numbering>
 </file>
@@ -2363,7 +3215,6 @@
   <w:style w:type="character" w:default="1" w:styleId="DefaultParagraphFont">
     <w:name w:val="Default Paragraph Font"/>
     <w:uiPriority w:val="1"/>
-    <w:semiHidden/>
     <w:unhideWhenUsed/>
   </w:style>
   <w:style w:type="table" w:default="1" w:styleId="TableNormal">
@@ -2698,6 +3549,41 @@
       </w:tblBorders>
     </w:tblPr>
   </w:style>
+  <w:style w:type="character" w:styleId="Hyperlink">
+    <w:name w:val="Hyperlink"/>
+    <w:basedOn w:val="DefaultParagraphFont"/>
+    <w:uiPriority w:val="99"/>
+    <w:unhideWhenUsed/>
+    <w:rsid w:val="00131B65"/>
+    <w:rPr>
+      <w:color w:val="0000FF" w:themeColor="hyperlink"/>
+      <w:u w:val="single"/>
+    </w:rPr>
+  </w:style>
+  <w:style w:type="character" w:styleId="UnresolvedMention">
+    <w:name w:val="Unresolved Mention"/>
+    <w:basedOn w:val="DefaultParagraphFont"/>
+    <w:uiPriority w:val="99"/>
+    <w:semiHidden/>
+    <w:unhideWhenUsed/>
+    <w:rsid w:val="00131B65"/>
+    <w:rPr>
+      <w:color w:val="605E5C"/>
+      <w:shd w:val="clear" w:color="auto" w:fill="E1DFDD"/>
+    </w:rPr>
+  </w:style>
+  <w:style w:type="character" w:styleId="FollowedHyperlink">
+    <w:name w:val="FollowedHyperlink"/>
+    <w:basedOn w:val="DefaultParagraphFont"/>
+    <w:uiPriority w:val="99"/>
+    <w:semiHidden/>
+    <w:unhideWhenUsed/>
+    <w:rsid w:val="00FE22A2"/>
+    <w:rPr>
+      <w:color w:val="800080" w:themeColor="followedHyperlink"/>
+      <w:u w:val="single"/>
+    </w:rPr>
+  </w:style>
 </w:styles>
 </file>
 

</xml_diff>